<commit_message>
Added Echo for Violin
</commit_message>
<xml_diff>
--- a/ManifestoOfTheHighResonant.docx
+++ b/ManifestoOfTheHighResonant.docx
@@ -414,7 +414,7 @@
           <w:r>
             <w:fldChar w:fldCharType="separate"/>
           </w:r>
-          <w:hyperlink w:anchor="_Toc222438815" w:history="1">
+          <w:hyperlink w:anchor="_Toc222919459" w:history="1">
             <w:r>
               <w:rPr>
                 <w:rStyle w:val="Hyperlink"/>
@@ -441,7 +441,7 @@
                 <w:noProof/>
                 <w:webHidden/>
               </w:rPr>
-              <w:instrText xml:space="preserve"> PAGEREF _Toc222438815 \h </w:instrText>
+              <w:instrText xml:space="preserve"> PAGEREF _Toc222919459 \h </w:instrText>
             </w:r>
             <w:r>
               <w:rPr>
@@ -488,7 +488,7 @@
               <w:lang w:val="en-IE" w:eastAsia="en-IE"/>
             </w:rPr>
           </w:pPr>
-          <w:hyperlink w:anchor="_Toc222438816" w:history="1">
+          <w:hyperlink w:anchor="_Toc222919460" w:history="1">
             <w:r>
               <w:rPr>
                 <w:rStyle w:val="Hyperlink"/>
@@ -515,7 +515,7 @@
                 <w:noProof/>
                 <w:webHidden/>
               </w:rPr>
-              <w:instrText xml:space="preserve"> PAGEREF _Toc222438816 \h </w:instrText>
+              <w:instrText xml:space="preserve"> PAGEREF _Toc222919460 \h </w:instrText>
             </w:r>
             <w:r>
               <w:rPr>
@@ -562,7 +562,7 @@
               <w:lang w:val="en-IE" w:eastAsia="en-IE"/>
             </w:rPr>
           </w:pPr>
-          <w:hyperlink w:anchor="_Toc222438817" w:history="1">
+          <w:hyperlink w:anchor="_Toc222919461" w:history="1">
             <w:r>
               <w:rPr>
                 <w:rStyle w:val="Hyperlink"/>
@@ -589,7 +589,7 @@
                 <w:noProof/>
                 <w:webHidden/>
               </w:rPr>
-              <w:instrText xml:space="preserve"> PAGEREF _Toc222438817 \h </w:instrText>
+              <w:instrText xml:space="preserve"> PAGEREF _Toc222919461 \h </w:instrText>
             </w:r>
             <w:r>
               <w:rPr>
@@ -636,7 +636,7 @@
               <w:lang w:val="en-IE" w:eastAsia="en-IE"/>
             </w:rPr>
           </w:pPr>
-          <w:hyperlink w:anchor="_Toc222438818" w:history="1">
+          <w:hyperlink w:anchor="_Toc222919462" w:history="1">
             <w:r>
               <w:rPr>
                 <w:rStyle w:val="Hyperlink"/>
@@ -663,7 +663,7 @@
                 <w:noProof/>
                 <w:webHidden/>
               </w:rPr>
-              <w:instrText xml:space="preserve"> PAGEREF _Toc222438818 \h </w:instrText>
+              <w:instrText xml:space="preserve"> PAGEREF _Toc222919462 \h </w:instrText>
             </w:r>
             <w:r>
               <w:rPr>
@@ -710,7 +710,7 @@
               <w:lang w:val="en-IE" w:eastAsia="en-IE"/>
             </w:rPr>
           </w:pPr>
-          <w:hyperlink w:anchor="_Toc222438819" w:history="1">
+          <w:hyperlink w:anchor="_Toc222919463" w:history="1">
             <w:r>
               <w:rPr>
                 <w:rStyle w:val="Hyperlink"/>
@@ -737,7 +737,7 @@
                 <w:noProof/>
                 <w:webHidden/>
               </w:rPr>
-              <w:instrText xml:space="preserve"> PAGEREF _Toc222438819 \h </w:instrText>
+              <w:instrText xml:space="preserve"> PAGEREF _Toc222919463 \h </w:instrText>
             </w:r>
             <w:r>
               <w:rPr>
@@ -784,7 +784,7 @@
               <w:lang w:val="en-IE" w:eastAsia="en-IE"/>
             </w:rPr>
           </w:pPr>
-          <w:hyperlink w:anchor="_Toc222438820" w:history="1">
+          <w:hyperlink w:anchor="_Toc222919464" w:history="1">
             <w:r>
               <w:rPr>
                 <w:rStyle w:val="Hyperlink"/>
@@ -811,7 +811,7 @@
                 <w:noProof/>
                 <w:webHidden/>
               </w:rPr>
-              <w:instrText xml:space="preserve"> PAGEREF _Toc222438820 \h </w:instrText>
+              <w:instrText xml:space="preserve"> PAGEREF _Toc222919464 \h </w:instrText>
             </w:r>
             <w:r>
               <w:rPr>
@@ -858,7 +858,7 @@
               <w:lang w:val="en-IE" w:eastAsia="en-IE"/>
             </w:rPr>
           </w:pPr>
-          <w:hyperlink w:anchor="_Toc222438821" w:history="1">
+          <w:hyperlink w:anchor="_Toc222919465" w:history="1">
             <w:r>
               <w:rPr>
                 <w:rStyle w:val="Hyperlink"/>
@@ -885,7 +885,7 @@
                 <w:noProof/>
                 <w:webHidden/>
               </w:rPr>
-              <w:instrText xml:space="preserve"> PAGEREF _Toc222438821 \h </w:instrText>
+              <w:instrText xml:space="preserve"> PAGEREF _Toc222919465 \h </w:instrText>
             </w:r>
             <w:r>
               <w:rPr>
@@ -932,7 +932,7 @@
               <w:lang w:val="en-IE" w:eastAsia="en-IE"/>
             </w:rPr>
           </w:pPr>
-          <w:hyperlink w:anchor="_Toc222438822" w:history="1">
+          <w:hyperlink w:anchor="_Toc222919466" w:history="1">
             <w:r>
               <w:rPr>
                 <w:rStyle w:val="Hyperlink"/>
@@ -959,7 +959,7 @@
                 <w:noProof/>
                 <w:webHidden/>
               </w:rPr>
-              <w:instrText xml:space="preserve"> PAGEREF _Toc222438822 \h </w:instrText>
+              <w:instrText xml:space="preserve"> PAGEREF _Toc222919466 \h </w:instrText>
             </w:r>
             <w:r>
               <w:rPr>
@@ -1004,7 +1004,7 @@
               <w:lang w:val="en-IE" w:eastAsia="en-IE"/>
             </w:rPr>
           </w:pPr>
-          <w:hyperlink w:anchor="_Toc222438823" w:history="1">
+          <w:hyperlink w:anchor="_Toc222919467" w:history="1">
             <w:r>
               <w:rPr>
                 <w:rStyle w:val="Hyperlink"/>
@@ -1031,7 +1031,7 @@
                 <w:noProof/>
                 <w:webHidden/>
               </w:rPr>
-              <w:instrText xml:space="preserve"> PAGEREF _Toc222438823 \h </w:instrText>
+              <w:instrText xml:space="preserve"> PAGEREF _Toc222919467 \h </w:instrText>
             </w:r>
             <w:r>
               <w:rPr>
@@ -1076,7 +1076,7 @@
               <w:lang w:val="en-IE" w:eastAsia="en-IE"/>
             </w:rPr>
           </w:pPr>
-          <w:hyperlink w:anchor="_Toc222438824" w:history="1">
+          <w:hyperlink w:anchor="_Toc222919468" w:history="1">
             <w:r>
               <w:rPr>
                 <w:rStyle w:val="Hyperlink"/>
@@ -1103,7 +1103,7 @@
                 <w:noProof/>
                 <w:webHidden/>
               </w:rPr>
-              <w:instrText xml:space="preserve"> PAGEREF _Toc222438824 \h </w:instrText>
+              <w:instrText xml:space="preserve"> PAGEREF _Toc222919468 \h </w:instrText>
             </w:r>
             <w:r>
               <w:rPr>
@@ -1150,7 +1150,7 @@
               <w:lang w:val="en-IE" w:eastAsia="en-IE"/>
             </w:rPr>
           </w:pPr>
-          <w:hyperlink w:anchor="_Toc222438825" w:history="1">
+          <w:hyperlink w:anchor="_Toc222919469" w:history="1">
             <w:r>
               <w:rPr>
                 <w:rStyle w:val="Hyperlink"/>
@@ -1177,7 +1177,7 @@
                 <w:noProof/>
                 <w:webHidden/>
               </w:rPr>
-              <w:instrText xml:space="preserve"> PAGEREF _Toc222438825 \h </w:instrText>
+              <w:instrText xml:space="preserve"> PAGEREF _Toc222919469 \h </w:instrText>
             </w:r>
             <w:r>
               <w:rPr>
@@ -1224,7 +1224,7 @@
               <w:lang w:val="en-IE" w:eastAsia="en-IE"/>
             </w:rPr>
           </w:pPr>
-          <w:hyperlink w:anchor="_Toc222438826" w:history="1">
+          <w:hyperlink w:anchor="_Toc222919470" w:history="1">
             <w:r>
               <w:rPr>
                 <w:rStyle w:val="Hyperlink"/>
@@ -1251,7 +1251,7 @@
                 <w:noProof/>
                 <w:webHidden/>
               </w:rPr>
-              <w:instrText xml:space="preserve"> PAGEREF _Toc222438826 \h </w:instrText>
+              <w:instrText xml:space="preserve"> PAGEREF _Toc222919470 \h </w:instrText>
             </w:r>
             <w:r>
               <w:rPr>
@@ -1298,7 +1298,7 @@
               <w:lang w:val="en-IE" w:eastAsia="en-IE"/>
             </w:rPr>
           </w:pPr>
-          <w:hyperlink w:anchor="_Toc222438827" w:history="1">
+          <w:hyperlink w:anchor="_Toc222919471" w:history="1">
             <w:r>
               <w:rPr>
                 <w:rStyle w:val="Hyperlink"/>
@@ -1325,7 +1325,7 @@
                 <w:noProof/>
                 <w:webHidden/>
               </w:rPr>
-              <w:instrText xml:space="preserve"> PAGEREF _Toc222438827 \h </w:instrText>
+              <w:instrText xml:space="preserve"> PAGEREF _Toc222919471 \h </w:instrText>
             </w:r>
             <w:r>
               <w:rPr>
@@ -1372,7 +1372,7 @@
               <w:lang w:val="en-IE" w:eastAsia="en-IE"/>
             </w:rPr>
           </w:pPr>
-          <w:hyperlink w:anchor="_Toc222438828" w:history="1">
+          <w:hyperlink w:anchor="_Toc222919472" w:history="1">
             <w:r>
               <w:rPr>
                 <w:rStyle w:val="Hyperlink"/>
@@ -1399,7 +1399,7 @@
                 <w:noProof/>
                 <w:webHidden/>
               </w:rPr>
-              <w:instrText xml:space="preserve"> PAGEREF _Toc222438828 \h </w:instrText>
+              <w:instrText xml:space="preserve"> PAGEREF _Toc222919472 \h </w:instrText>
             </w:r>
             <w:r>
               <w:rPr>
@@ -1446,12 +1446,86 @@
               <w:lang w:val="en-IE" w:eastAsia="en-IE"/>
             </w:rPr>
           </w:pPr>
-          <w:hyperlink w:anchor="_Toc222438829" w:history="1">
+          <w:hyperlink w:anchor="_Toc222919473" w:history="1">
             <w:r>
               <w:rPr>
                 <w:rStyle w:val="Hyperlink"/>
                 <w:noProof/>
               </w:rPr>
+              <w:t>Echo of the Violin</w:t>
+            </w:r>
+            <w:r>
+              <w:rPr>
+                <w:noProof/>
+                <w:webHidden/>
+              </w:rPr>
+              <w:tab/>
+            </w:r>
+            <w:r>
+              <w:rPr>
+                <w:noProof/>
+                <w:webHidden/>
+              </w:rPr>
+              <w:fldChar w:fldCharType="begin"/>
+            </w:r>
+            <w:r>
+              <w:rPr>
+                <w:noProof/>
+                <w:webHidden/>
+              </w:rPr>
+              <w:instrText xml:space="preserve"> PAGEREF _Toc222919473 \h </w:instrText>
+            </w:r>
+            <w:r>
+              <w:rPr>
+                <w:noProof/>
+                <w:webHidden/>
+              </w:rPr>
+            </w:r>
+            <w:r>
+              <w:rPr>
+                <w:noProof/>
+                <w:webHidden/>
+              </w:rPr>
+              <w:fldChar w:fldCharType="separate"/>
+            </w:r>
+            <w:r>
+              <w:rPr>
+                <w:noProof/>
+                <w:webHidden/>
+              </w:rPr>
+              <w:t>5</w:t>
+            </w:r>
+            <w:r>
+              <w:rPr>
+                <w:noProof/>
+                <w:webHidden/>
+              </w:rPr>
+              <w:fldChar w:fldCharType="end"/>
+            </w:r>
+          </w:hyperlink>
+        </w:p>
+        <w:p>
+          <w:pPr>
+            <w:pStyle w:val="TOC2"/>
+            <w:tabs>
+              <w:tab w:val="right" w:leader="dot" w:pos="9016"/>
+            </w:tabs>
+            <w:rPr>
+              <w:rFonts w:eastAsiaTheme="minorEastAsia"/>
+              <w:b w:val="0"/>
+              <w:bCs w:val="0"/>
+              <w:noProof/>
+              <w:sz w:val="24"/>
+              <w:szCs w:val="24"/>
+              <w:lang w:val="en-IE" w:eastAsia="en-IE"/>
+            </w:rPr>
+          </w:pPr>
+          <w:hyperlink w:anchor="_Toc222919474" w:history="1">
+            <w:r>
+              <w:rPr>
+                <w:rStyle w:val="Hyperlink"/>
+                <w:noProof/>
+              </w:rPr>
               <w:t>Echo of the Quiet Sea</w:t>
             </w:r>
             <w:r>
@@ -1473,7 +1547,7 @@
                 <w:noProof/>
                 <w:webHidden/>
               </w:rPr>
-              <w:instrText xml:space="preserve"> PAGEREF _Toc222438829 \h </w:instrText>
+              <w:instrText xml:space="preserve"> PAGEREF _Toc222919474 \h </w:instrText>
             </w:r>
             <w:r>
               <w:rPr>
@@ -1493,7 +1567,7 @@
                 <w:noProof/>
                 <w:webHidden/>
               </w:rPr>
-              <w:t>5</w:t>
+              <w:t>6</w:t>
             </w:r>
             <w:r>
               <w:rPr>
@@ -1520,7 +1594,7 @@
               <w:lang w:val="en-IE" w:eastAsia="en-IE"/>
             </w:rPr>
           </w:pPr>
-          <w:hyperlink w:anchor="_Toc222438830" w:history="1">
+          <w:hyperlink w:anchor="_Toc222919475" w:history="1">
             <w:r>
               <w:rPr>
                 <w:rStyle w:val="Hyperlink"/>
@@ -1547,7 +1621,7 @@
                 <w:noProof/>
                 <w:webHidden/>
               </w:rPr>
-              <w:instrText xml:space="preserve"> PAGEREF _Toc222438830 \h </w:instrText>
+              <w:instrText xml:space="preserve"> PAGEREF _Toc222919475 \h </w:instrText>
             </w:r>
             <w:r>
               <w:rPr>
@@ -1567,7 +1641,7 @@
                 <w:noProof/>
                 <w:webHidden/>
               </w:rPr>
-              <w:t>5</w:t>
+              <w:t>7</w:t>
             </w:r>
             <w:r>
               <w:rPr>
@@ -1594,7 +1668,7 @@
               <w:lang w:val="en-IE" w:eastAsia="en-IE"/>
             </w:rPr>
           </w:pPr>
-          <w:hyperlink w:anchor="_Toc222438831" w:history="1">
+          <w:hyperlink w:anchor="_Toc222919476" w:history="1">
             <w:r>
               <w:rPr>
                 <w:rStyle w:val="Hyperlink"/>
@@ -1621,7 +1695,7 @@
                 <w:noProof/>
                 <w:webHidden/>
               </w:rPr>
-              <w:instrText xml:space="preserve"> PAGEREF _Toc222438831 \h </w:instrText>
+              <w:instrText xml:space="preserve"> PAGEREF _Toc222919476 \h </w:instrText>
             </w:r>
             <w:r>
               <w:rPr>
@@ -1641,7 +1715,7 @@
                 <w:noProof/>
                 <w:webHidden/>
               </w:rPr>
-              <w:t>5</w:t>
+              <w:t>7</w:t>
             </w:r>
             <w:r>
               <w:rPr>
@@ -1668,7 +1742,7 @@
               <w:lang w:val="en-IE" w:eastAsia="en-IE"/>
             </w:rPr>
           </w:pPr>
-          <w:hyperlink w:anchor="_Toc222438832" w:history="1">
+          <w:hyperlink w:anchor="_Toc222919477" w:history="1">
             <w:r>
               <w:rPr>
                 <w:rStyle w:val="Hyperlink"/>
@@ -1695,7 +1769,7 @@
                 <w:noProof/>
                 <w:webHidden/>
               </w:rPr>
-              <w:instrText xml:space="preserve"> PAGEREF _Toc222438832 \h </w:instrText>
+              <w:instrText xml:space="preserve"> PAGEREF _Toc222919477 \h </w:instrText>
             </w:r>
             <w:r>
               <w:rPr>
@@ -1715,7 +1789,7 @@
                 <w:noProof/>
                 <w:webHidden/>
               </w:rPr>
-              <w:t>5</w:t>
+              <w:t>7</w:t>
             </w:r>
             <w:r>
               <w:rPr>
@@ -1747,66 +1821,12 @@
       <w:pPr>
         <w:pStyle w:val="Heading1"/>
       </w:pPr>
-      <w:bookmarkStart w:id="0" w:name="_Toc222438815"/>
+      <w:bookmarkStart w:id="0" w:name="_Toc222919459"/>
       <w:r>
         <w:lastRenderedPageBreak/>
         <w:t>Prologue</w:t>
       </w:r>
       <w:bookmarkEnd w:id="0"/>
-    </w:p>
-    <w:p>
-      <w:r>
-        <w:t>The Quiet are not a plague. It was a Great Hush. The machines. The radios. The chatter. It was a fever of noise. The Old World could no longer hear itself. It found a way to make us quiet.</w:t>
-      </w:r>
-    </w:p>
-    <w:p>
-      <w:r>
-        <w:t>Is it still?</w:t>
-      </w:r>
-    </w:p>
-    <w:p/>
-    <w:p>
-      <w:pPr>
-        <w:pStyle w:val="Heading1"/>
-      </w:pPr>
-      <w:bookmarkStart w:id="1" w:name="_Toc222438816"/>
-      <w:r>
-        <w:t>History</w:t>
-      </w:r>
-      <w:bookmarkEnd w:id="1"/>
-    </w:p>
-    <w:p>
-      <w:pPr>
-        <w:pStyle w:val="Heading2"/>
-      </w:pPr>
-      <w:bookmarkStart w:id="2" w:name="_Toc222438817"/>
-      <w:r>
-        <w:t>The Old World</w:t>
-      </w:r>
-      <w:bookmarkEnd w:id="2"/>
-    </w:p>
-    <w:p>
-      <w:pPr>
-        <w:pStyle w:val="Heading2"/>
-      </w:pPr>
-      <w:bookmarkStart w:id="3" w:name="_Toc222438818"/>
-      <w:r>
-        <w:t>The Great Hush</w:t>
-      </w:r>
-      <w:bookmarkEnd w:id="3"/>
-    </w:p>
-    <w:p>
-      <w:pPr>
-        <w:pStyle w:val="Heading2"/>
-      </w:pPr>
-      <w:bookmarkStart w:id="4" w:name="_Toc222438819"/>
-      <w:r>
-        <w:t xml:space="preserve">The </w:t>
-      </w:r>
-      <w:r>
-        <w:t>Resonance</w:t>
-      </w:r>
-      <w:bookmarkEnd w:id="4"/>
     </w:p>
     <w:p>
       <w:pPr>
@@ -1824,52 +1844,125 @@
           <w:position w:val="-10"/>
           <w:sz w:val="119"/>
         </w:rPr>
-        <w:t>E</w:t>
-      </w:r>
-    </w:p>
-    <w:p>
-      <w:r>
-        <w:t xml:space="preserve">verything in this world, new or old, has a frequency. Steel. Bone. Blood. Flesh. The High Resonant has found the one True Note. A mere follower may not here it for they are not worthy, however they may hear the Resonance. It is not heard with the ear, nor measured by the machines of the Old World. It is felt from within. When a soul is attuned to the Resonance, it does not silence the body. It purifies it. </w:t>
-      </w:r>
-      <w:r>
-        <w:t xml:space="preserve">You no longer feel hunger. You no longer feel fear. You feel </w:t>
-      </w:r>
-      <w:r>
-        <w:t>nought but</w:t>
-      </w:r>
-      <w:r>
-        <w:t xml:space="preserve"> the vibration of the silence. The vibration of purit</w:t>
-      </w:r>
-      <w:r>
-        <w:t>y.</w:t>
+        <w:t>T</w:t>
+      </w:r>
+    </w:p>
+    <w:p>
+      <w:r>
+        <w:t>he Quiet are not a plague. It was a Great Hush. The machines. The radios. The chatter. It was a fever of noise. The Old World could no longer hear itself. It found a way to make us quiet.</w:t>
+      </w:r>
+    </w:p>
+    <w:p>
+      <w:r>
+        <w:t>Is it still?</w:t>
       </w:r>
     </w:p>
     <w:p/>
+    <w:p>
+      <w:pPr>
+        <w:pStyle w:val="Heading1"/>
+      </w:pPr>
+      <w:bookmarkStart w:id="1" w:name="_Toc222919460"/>
+      <w:r>
+        <w:t>History</w:t>
+      </w:r>
+      <w:bookmarkEnd w:id="1"/>
+    </w:p>
     <w:p>
       <w:pPr>
         <w:pStyle w:val="Heading2"/>
       </w:pPr>
-      <w:bookmarkStart w:id="5" w:name="_Toc222438820"/>
-      <w:r>
-        <w:t>The High Resonant</w:t>
-      </w:r>
-      <w:bookmarkEnd w:id="5"/>
+      <w:bookmarkStart w:id="2" w:name="_Toc222919461"/>
+      <w:r>
+        <w:t>The Old World</w:t>
+      </w:r>
+      <w:bookmarkEnd w:id="2"/>
     </w:p>
     <w:p>
       <w:pPr>
         <w:pStyle w:val="Heading2"/>
       </w:pPr>
-      <w:bookmarkStart w:id="6" w:name="_Toc222438821"/>
-      <w:r>
-        <w:t>The Word of the Quiet</w:t>
-      </w:r>
-      <w:bookmarkEnd w:id="6"/>
+      <w:bookmarkStart w:id="3" w:name="_Toc222919462"/>
+      <w:r>
+        <w:t>The Great Hush</w:t>
+      </w:r>
+      <w:bookmarkEnd w:id="3"/>
     </w:p>
     <w:p>
       <w:pPr>
         <w:pStyle w:val="Heading2"/>
       </w:pPr>
-      <w:bookmarkStart w:id="7" w:name="_Toc222438822"/>
+      <w:bookmarkStart w:id="4" w:name="_Toc222919463"/>
+      <w:r>
+        <w:t xml:space="preserve">The </w:t>
+      </w:r>
+      <w:r>
+        <w:t>Resonance</w:t>
+      </w:r>
+      <w:bookmarkEnd w:id="4"/>
+    </w:p>
+    <w:p>
+      <w:pPr>
+        <w:keepNext/>
+        <w:framePr w:dropCap="drop" w:lines="3" w:wrap="around" w:vAnchor="text" w:hAnchor="text"/>
+        <w:spacing w:after="0" w:line="1135" w:lineRule="exact"/>
+        <w:textAlignment w:val="baseline"/>
+        <w:rPr>
+          <w:position w:val="-10"/>
+          <w:sz w:val="119"/>
+        </w:rPr>
+      </w:pPr>
+      <w:r>
+        <w:rPr>
+          <w:position w:val="-10"/>
+          <w:sz w:val="119"/>
+        </w:rPr>
+        <w:t>E</w:t>
+      </w:r>
+    </w:p>
+    <w:p>
+      <w:r>
+        <w:t xml:space="preserve">verything in this world, new or old, has a frequency. Steel. Bone. Blood. Flesh. The High Resonant has found the one True Note. A mere follower may not here it for they are not worthy, however they may hear the Resonance. It is not heard with the ear, nor measured by the machines of the Old World. It is felt from within. When a soul is attuned to the Resonance, it does not silence the body. It purifies it. </w:t>
+      </w:r>
+      <w:r>
+        <w:t xml:space="preserve">You no longer feel hunger. You no longer feel fear. You feel </w:t>
+      </w:r>
+      <w:r>
+        <w:t>nought but</w:t>
+      </w:r>
+      <w:r>
+        <w:t xml:space="preserve"> the vibration of the silence. The vibration of purit</w:t>
+      </w:r>
+      <w:r>
+        <w:t>y.</w:t>
+      </w:r>
+    </w:p>
+    <w:p/>
+    <w:p>
+      <w:pPr>
+        <w:pStyle w:val="Heading2"/>
+      </w:pPr>
+      <w:bookmarkStart w:id="5" w:name="_Toc222919464"/>
+      <w:r>
+        <w:t>The High Resonant</w:t>
+      </w:r>
+      <w:bookmarkEnd w:id="5"/>
+    </w:p>
+    <w:p>
+      <w:pPr>
+        <w:pStyle w:val="Heading2"/>
+      </w:pPr>
+      <w:bookmarkStart w:id="6" w:name="_Toc222919465"/>
+      <w:r>
+        <w:t>The Word of the Quiet</w:t>
+      </w:r>
+      <w:bookmarkEnd w:id="6"/>
+    </w:p>
+    <w:p>
+      <w:pPr>
+        <w:pStyle w:val="Heading2"/>
+      </w:pPr>
+      <w:bookmarkStart w:id="7" w:name="_Toc222919466"/>
       <w:r>
         <w:t>The Voices</w:t>
       </w:r>
@@ -1922,7 +2015,7 @@
       <w:pPr>
         <w:pStyle w:val="Heading3"/>
       </w:pPr>
-      <w:bookmarkStart w:id="8" w:name="_Toc222438823"/>
+      <w:bookmarkStart w:id="8" w:name="_Toc222919467"/>
       <w:r>
         <w:t>Voice of the Scroll</w:t>
       </w:r>
@@ -1992,7 +2085,7 @@
       <w:pPr>
         <w:pStyle w:val="Heading3"/>
       </w:pPr>
-      <w:bookmarkStart w:id="9" w:name="_Toc222438824"/>
+      <w:bookmarkStart w:id="9" w:name="_Toc222919468"/>
       <w:r>
         <w:t>Voice of the Silent</w:t>
       </w:r>
@@ -2002,7 +2095,7 @@
       <w:pPr>
         <w:pStyle w:val="Heading2"/>
       </w:pPr>
-      <w:bookmarkStart w:id="10" w:name="_Toc222438825"/>
+      <w:bookmarkStart w:id="10" w:name="_Toc222919469"/>
       <w:r>
         <w:t>The Whispers</w:t>
       </w:r>
@@ -2044,7 +2137,7 @@
       <w:pPr>
         <w:pStyle w:val="Heading1"/>
       </w:pPr>
-      <w:bookmarkStart w:id="11" w:name="_Toc222438826"/>
+      <w:bookmarkStart w:id="11" w:name="_Toc222919470"/>
       <w:r>
         <w:t>Echoes</w:t>
       </w:r>
@@ -2057,7 +2150,7 @@
       <w:pPr>
         <w:pStyle w:val="Heading2"/>
       </w:pPr>
-      <w:bookmarkStart w:id="12" w:name="_Toc222438827"/>
+      <w:bookmarkStart w:id="12" w:name="_Toc222919471"/>
       <w:r>
         <w:t>Echo of the Resonance</w:t>
       </w:r>
@@ -2084,7 +2177,19 @@
     </w:p>
     <w:p>
       <w:r>
-        <w:t>efore he became High Resonant, Father Vertis was a keeper of books. When the Great Hush came to be, they swarmed the library. Thousands of Quiet, screaming and tearing. It is told that when they reached the basement, they did not bite Father Vertis.</w:t>
+        <w:t xml:space="preserve">efore he became High Resonant, </w:t>
+      </w:r>
+      <w:r>
+        <w:t>Anton</w:t>
+      </w:r>
+      <w:r>
+        <w:t xml:space="preserve"> Vertis was a keeper of books. When the Great Hush came to be, they swarmed the library. Thousands of Quiet, screaming and tearing. It is told that when they reached the basement, they did not bite </w:t>
+      </w:r>
+      <w:r>
+        <w:t>him</w:t>
+      </w:r>
+      <w:r>
+        <w:t>.</w:t>
       </w:r>
     </w:p>
     <w:p>
@@ -2095,12 +2200,24 @@
         <w:t xml:space="preserve"> </w:t>
       </w:r>
       <w:r>
-        <w:t>found him sitting in the dark, reading a book by candlelight. The Quiet stood around him. Hundreds of them. They did not growl nor snap. They began to sway to the rhythm of his breathing.</w:t>
-      </w:r>
-    </w:p>
-    <w:p>
-      <w:r>
-        <w:t>This is why the Voices and Whispers walk the lands without fear. They are not hiding from the Quiet; they are harmonising with them. We are all part of the same breath now.</w:t>
+        <w:t xml:space="preserve">found </w:t>
+      </w:r>
+      <w:r>
+        <w:t>Anton</w:t>
+      </w:r>
+      <w:r>
+        <w:t xml:space="preserve"> sitting in the dark, reading a book by candlelight. The Quiet stood around him. Hundreds of them. They did not growl nor snap. They began to sway to the rhythm of his breathing.</w:t>
+      </w:r>
+    </w:p>
+    <w:p>
+      <w:r>
+        <w:t xml:space="preserve">This is why the </w:t>
+      </w:r>
+      <w:r>
+        <w:t>Word of the Quiet</w:t>
+      </w:r>
+      <w:r>
+        <w:t xml:space="preserve"> walk the lands without fear. They are not hiding from the Quiet; they are harmonising with them. We are all part of the same breath now.</w:t>
       </w:r>
     </w:p>
     <w:p>
@@ -2113,15 +2230,34 @@
       <w:pPr>
         <w:pStyle w:val="Heading2"/>
       </w:pPr>
-      <w:bookmarkStart w:id="13" w:name="_Toc222438828"/>
+      <w:bookmarkStart w:id="13" w:name="_Toc222919472"/>
       <w:r>
         <w:t>Echo of the Silent Execution</w:t>
       </w:r>
       <w:bookmarkEnd w:id="13"/>
     </w:p>
     <w:p>
-      <w:r>
-        <w:t xml:space="preserve">In the early days of the Great Hush, there was a man who roamed the lands. He was strong and fearless, but he carried his rifle as though the world still listened to thunder. He laughed too loudly. He fired too freely. He said the Quiet were but beasts to be hunted and nothing more. </w:t>
+      <w:pPr>
+        <w:keepNext/>
+        <w:framePr w:dropCap="drop" w:lines="3" w:wrap="around" w:vAnchor="text" w:hAnchor="text"/>
+        <w:spacing w:after="0" w:line="1135" w:lineRule="exact"/>
+        <w:textAlignment w:val="baseline"/>
+        <w:rPr>
+          <w:position w:val="-10"/>
+          <w:sz w:val="119"/>
+        </w:rPr>
+      </w:pPr>
+      <w:r>
+        <w:rPr>
+          <w:position w:val="-10"/>
+          <w:sz w:val="119"/>
+        </w:rPr>
+        <w:t>I</w:t>
+      </w:r>
+    </w:p>
+    <w:p>
+      <w:r>
+        <w:t xml:space="preserve">n the early days of the Great Hush, there was a man who roamed the lands. He was strong and fearless, but he carried his rifle as though the world still listened to thunder. He laughed too loudly. He fired too freely. He said the Quiet were but beasts to be hunted and nothing more. </w:t>
       </w:r>
     </w:p>
     <w:p>
@@ -2135,13 +2271,7 @@
       </w:r>
       <w:r>
         <w:lastRenderedPageBreak/>
-        <w:t xml:space="preserve">was quick, and the body fell silently. The man had been </w:t>
-      </w:r>
-      <w:r>
-        <w:t>purified and</w:t>
-      </w:r>
-      <w:r>
-        <w:t xml:space="preserve"> had become one with the Resonance. </w:t>
+        <w:t xml:space="preserve">was quick, and the body fell silently. The man had been purified and had become one with the Resonance. </w:t>
       </w:r>
     </w:p>
     <w:p>
@@ -2154,11 +2284,133 @@
       <w:pPr>
         <w:pStyle w:val="Heading2"/>
       </w:pPr>
-      <w:bookmarkStart w:id="14" w:name="_Toc222438829"/>
+      <w:bookmarkStart w:id="14" w:name="_Toc222919473"/>
+      <w:r>
+        <w:t>Echo of the Violin</w:t>
+      </w:r>
+      <w:bookmarkEnd w:id="14"/>
+    </w:p>
+    <w:p>
+      <w:pPr>
+        <w:keepNext/>
+        <w:framePr w:dropCap="drop" w:lines="3" w:wrap="around" w:vAnchor="text" w:hAnchor="text"/>
+        <w:spacing w:after="0" w:line="1135" w:lineRule="exact"/>
+        <w:textAlignment w:val="baseline"/>
+        <w:rPr>
+          <w:position w:val="-10"/>
+          <w:sz w:val="119"/>
+        </w:rPr>
+      </w:pPr>
+      <w:r>
+        <w:rPr>
+          <w:position w:val="-10"/>
+          <w:sz w:val="119"/>
+        </w:rPr>
+        <w:t>I</w:t>
+      </w:r>
+    </w:p>
+    <w:p>
+      <w:r>
+        <w:t>n a looted house on the edge of a long abandoned town laid a lone violin. The windows were shattered and the doors torn from their hinges, yet the instrument remained intact beneath a dust-covered bed in a black case. A Whisper brough it back to their sanctuary as one might carry a relic.</w:t>
+      </w:r>
+    </w:p>
+    <w:p>
+      <w:r>
+        <w:t>For many nights, the case remained unopen. Music belonged to the Old World, and the Old World was loud.</w:t>
+      </w:r>
+    </w:p>
+    <w:p>
+      <w:r>
+        <w:t xml:space="preserve">As time passed, one man among the flock, one who remembered concerts and crowded halls, asked permission to play. The High Resonant did not forbid </w:t>
+      </w:r>
+      <w:r>
+        <w:t>him but</w:t>
+      </w:r>
+      <w:r>
+        <w:t xml:space="preserve"> asked that the man listen first.</w:t>
+      </w:r>
+    </w:p>
+    <w:p>
+      <w:r>
+        <w:t xml:space="preserve">The man took the violin and carried out into the streets of old, where the Quiet wandered aimlessly between abandoned cars. He lifted the </w:t>
+      </w:r>
+      <w:r>
+        <w:t>violin and</w:t>
+      </w:r>
+      <w:r>
+        <w:t xml:space="preserve"> drew the bow gently across the strings. </w:t>
+      </w:r>
+    </w:p>
+    <w:p>
+      <w:r>
+        <w:t xml:space="preserve">The first note was soft. Clear and </w:t>
+      </w:r>
+      <w:r>
+        <w:t>beautiful</w:t>
+      </w:r>
+      <w:r>
+        <w:t>. The second carried further down the long street. By the third note, the streets had changed. The Quiet began to turn their heads. Not in anger, but in attention. One by one, they drifted closer. Not running. Not snarling. Simply gathering, as though drawn by something familiar yet misplaced.</w:t>
+      </w:r>
+    </w:p>
+    <w:p>
+      <w:r>
+        <w:t xml:space="preserve">The man played louder, mistaking their approach for </w:t>
+      </w:r>
+      <w:r>
+        <w:t>reverence</w:t>
+      </w:r>
+      <w:r>
+        <w:t xml:space="preserve"> and excitement. The melody swelled as they continued </w:t>
+      </w:r>
+      <w:r>
+        <w:t>towards</w:t>
+      </w:r>
+      <w:r>
+        <w:t xml:space="preserve"> him. The circle tightened as he played.</w:t>
+      </w:r>
+    </w:p>
+    <w:p>
+      <w:r>
+        <w:t xml:space="preserve">A Voice stepped forward and placed a hand upon his shoulder. "Enough", he said quietly. The music stopped, the last vibration fading into the air. </w:t>
+      </w:r>
+    </w:p>
+    <w:p>
+      <w:r>
+        <w:t xml:space="preserve">The Quiet stood, motionless, for a long moment. They began to turn and resume wandering, as if nothing had </w:t>
+      </w:r>
+      <w:r>
+        <w:t>occurred</w:t>
+      </w:r>
+      <w:r>
+        <w:t>.</w:t>
+      </w:r>
+    </w:p>
+    <w:p>
+      <w:r>
+        <w:lastRenderedPageBreak/>
+        <w:t>The violin was never played again. In time, a Whisper loosened its strings so that it would never hold the tension it once had.</w:t>
+      </w:r>
+    </w:p>
+    <w:p>
+      <w:r>
+        <w:t xml:space="preserve">It is told that the instrument itself was not wrong. It was too eager to be heard. </w:t>
+      </w:r>
+    </w:p>
+    <w:p>
+      <w:r>
+        <w:t>Is it still?</w:t>
+      </w:r>
+    </w:p>
+    <w:p/>
+    <w:p>
+      <w:pPr>
+        <w:pStyle w:val="Heading2"/>
+      </w:pPr>
+      <w:bookmarkStart w:id="15" w:name="_Toc222919474"/>
       <w:r>
         <w:t>Echo of the Quiet Sea</w:t>
       </w:r>
-      <w:bookmarkEnd w:id="14"/>
+      <w:bookmarkEnd w:id="15"/>
     </w:p>
     <w:p>
       <w:pPr>
@@ -2211,40 +2463,59 @@
       <w:pPr>
         <w:pStyle w:val="Heading1"/>
       </w:pPr>
-      <w:bookmarkStart w:id="15" w:name="_Toc222438830"/>
-      <w:r>
+      <w:bookmarkStart w:id="16" w:name="_Toc222919475"/>
+      <w:r>
+        <w:lastRenderedPageBreak/>
         <w:t>Doctrine</w:t>
       </w:r>
-      <w:bookmarkEnd w:id="15"/>
+      <w:bookmarkEnd w:id="16"/>
     </w:p>
     <w:p>
       <w:pPr>
         <w:pStyle w:val="Heading1"/>
       </w:pPr>
-      <w:bookmarkStart w:id="16" w:name="_Toc222438831"/>
+      <w:bookmarkStart w:id="17" w:name="_Toc222919476"/>
       <w:r>
         <w:t>Practices</w:t>
       </w:r>
-      <w:bookmarkEnd w:id="16"/>
+      <w:bookmarkEnd w:id="17"/>
     </w:p>
     <w:p>
       <w:pPr>
         <w:pStyle w:val="Heading1"/>
       </w:pPr>
-      <w:bookmarkStart w:id="17" w:name="_Toc222438832"/>
+      <w:bookmarkStart w:id="18" w:name="_Toc222919477"/>
       <w:r>
         <w:t>The End Times</w:t>
       </w:r>
-      <w:bookmarkEnd w:id="17"/>
-    </w:p>
-    <w:p>
-      <w:r>
-        <w:t>There shall come a day when the last radio fails. When the last engine rusts. When the last human scream fades into silence. On that day, the Attunement.</w:t>
-      </w:r>
-    </w:p>
-    <w:p>
-      <w:r>
-        <w:lastRenderedPageBreak/>
+      <w:bookmarkEnd w:id="18"/>
+    </w:p>
+    <w:p>
+      <w:pPr>
+        <w:keepNext/>
+        <w:framePr w:dropCap="drop" w:lines="3" w:wrap="around" w:vAnchor="text" w:hAnchor="text"/>
+        <w:spacing w:after="0" w:line="1135" w:lineRule="exact"/>
+        <w:textAlignment w:val="baseline"/>
+        <w:rPr>
+          <w:position w:val="-10"/>
+          <w:sz w:val="119"/>
+        </w:rPr>
+      </w:pPr>
+      <w:r>
+        <w:rPr>
+          <w:position w:val="-10"/>
+          <w:sz w:val="119"/>
+        </w:rPr>
+        <w:t>T</w:t>
+      </w:r>
+    </w:p>
+    <w:p>
+      <w:r>
+        <w:t>here shall come a day when the last radio fails. When the last engine rusts. When the last human scream fades into silence. On that day, the Attunement.</w:t>
+      </w:r>
+    </w:p>
+    <w:p>
+      <w:r>
         <w:t>Will you be part of the music? Or are you but the static that must be cleared?</w:t>
       </w:r>
     </w:p>
@@ -2389,6 +2660,7 @@
         </v:shapetype>
         <v:shape id="WordPictureWatermark18269235" o:spid="_x0000_s1046" type="#_x0000_t75" style="position:absolute;margin-left:0;margin-top:0;width:596.15pt;height:842.2pt;z-index:-251657216;mso-position-horizontal:center;mso-position-horizontal-relative:margin;mso-position-vertical:center;mso-position-vertical-relative:margin" o:allowincell="f">
           <v:imagedata r:id="rId1" o:title="Artboard 1" gain="19661f" blacklevel="22938f"/>
+          <w10:wrap anchorx="margin" anchory="margin"/>
         </v:shape>
       </w:pict>
     </w:r>
@@ -2428,6 +2700,7 @@
         </v:shapetype>
         <v:shape id="WordPictureWatermark18269236" o:spid="_x0000_s1047" type="#_x0000_t75" style="position:absolute;margin-left:0;margin-top:0;width:596.15pt;height:842.2pt;z-index:-251656192;mso-position-horizontal:center;mso-position-horizontal-relative:margin;mso-position-vertical:center;mso-position-vertical-relative:margin" o:allowincell="f">
           <v:imagedata r:id="rId1" o:title="Artboard 1" gain="19661f" blacklevel="22938f"/>
+          <w10:wrap anchorx="margin" anchory="margin"/>
         </v:shape>
       </w:pict>
     </w:r>
@@ -2467,6 +2740,7 @@
         </v:shapetype>
         <v:shape id="WordPictureWatermark18269234" o:spid="_x0000_s1045" type="#_x0000_t75" style="position:absolute;margin-left:0;margin-top:0;width:596.15pt;height:842.2pt;z-index:-251658240;mso-position-horizontal:center;mso-position-horizontal-relative:margin;mso-position-vertical:center;mso-position-vertical-relative:margin" o:allowincell="f">
           <v:imagedata r:id="rId1" o:title="Artboard 1" gain="19661f" blacklevel="22938f"/>
+          <w10:wrap anchorx="margin" anchory="margin"/>
         </v:shape>
       </w:pict>
     </w:r>
@@ -3780,9 +4054,13 @@
     <w:rsid w:val="00657A5A"/>
     <w:rsid w:val="00792A04"/>
     <w:rsid w:val="008236F3"/>
+    <w:rsid w:val="00844511"/>
     <w:rsid w:val="008A443B"/>
     <w:rsid w:val="00A93532"/>
     <w:rsid w:val="00BA4AAE"/>
+    <w:rsid w:val="00C63DC8"/>
+    <w:rsid w:val="00C834BB"/>
+    <w:rsid w:val="00DB6AAA"/>
   </w:rsids>
   <m:mathPr>
     <m:mathFont m:val="Cambria Math"/>

</xml_diff>